<commit_message>
Separation en 2 documents : rapport de seance (factuel) + demarche d'orientation
- generateReport.js : buildReportDoc (verbatim/recap/signaux) sans la demarche ;
  buildDemarcheDoc (marche a suivre + rappels) dans un .docx separe
- exemple genere les 2 fichiers

Co-Authored-By: Claude Opus 4.8 (1M context) <noreply@anthropic.com>
</commit_message>
<xml_diff>
--- a/docs/Rapport_Billy_exemple.docx
+++ b/docs/Rapport_Billy_exemple.docx
@@ -29,7 +29,7 @@
           <w:sz w:val="18"/>
           <w:szCs w:val="18"/>
         </w:rPr>
-        <w:t xml:space="preserve">Compte rendu factuel, sans interprétation. Billy n’est pas un outil de diagnostic ni une preuve : ce document rapporte les mots de l’enfant pour être transmis à un professionnel.</w:t>
+        <w:t xml:space="preserve">Compte rendu factuel, sans interprétation. Billy n’est pas un outil de diagnostic ni une preuve : ce document rapporte les mots de l’enfant pour être transmis à un professionnel. La marche à suivre figure dans un document séparé.</w:t>
       </w:r>
     </w:p>
     <w:p>
@@ -615,308 +615,6 @@
     </w:p>
     <w:p>
       <w:pPr>
-        <w:spacing w:after="160"/>
-      </w:pPr>
-      <w:r>
-        <w:rPr>
-          <w:i/>
-          <w:iCs/>
-          <w:color w:val="7A6F77"/>
-          <w:sz w:val="18"/>
-          <w:szCs w:val="18"/>
-        </w:rPr>
-        <w:t xml:space="preserve">S’il y avait eu un signal (peur d’une personne, douleur, « secret », détresse…), il aurait été listé ici et la démarche ci-dessous serait à enclencher.</w:t>
-      </w:r>
-    </w:p>
-    <w:p>
-      <w:pPr>
-        <w:pStyle w:val="Heading2"/>
-        <w:spacing w:before="240"/>
-      </w:pPr>
-      <w:r>
-        <w:t xml:space="preserve">Démarche à suivre si un risque est identifié</w:t>
-      </w:r>
-    </w:p>
-    <w:tbl>
-      <w:tblPr>
-        <w:tblW w:type="pct" w:w="100%"/>
-        <w:tblBorders>
-          <w:top w:val="single" w:color="auto" w:sz="4"/>
-          <w:left w:val="single" w:color="auto" w:sz="4"/>
-          <w:bottom w:val="single" w:color="auto" w:sz="4"/>
-          <w:right w:val="single" w:color="auto" w:sz="4"/>
-          <w:insideH w:val="single" w:color="auto" w:sz="4"/>
-          <w:insideV w:val="single" w:color="auto" w:sz="4"/>
-        </w:tblBorders>
-      </w:tblPr>
-      <w:tblGrid>
-        <w:gridCol w:w="100"/>
-        <w:gridCol w:w="100"/>
-      </w:tblGrid>
-      <w:tr>
-        <w:trPr>
-          <w:tblHeader/>
-        </w:trPr>
-        <w:tc>
-          <w:tcPr>
-            <w:shd w:fill="EC6A9C"/>
-          </w:tcPr>
-          <w:p>
-            <w:pPr>
-              <w:spacing w:after="120"/>
-            </w:pPr>
-            <w:r>
-              <w:rPr>
-                <w:b/>
-                <w:bCs/>
-                <w:color w:val="FFFFFF"/>
-                <w:sz w:val="20"/>
-                <w:szCs w:val="20"/>
-              </w:rPr>
-              <w:t xml:space="preserve">Situation</w:t>
-            </w:r>
-          </w:p>
-        </w:tc>
-        <w:tc>
-          <w:tcPr>
-            <w:shd w:fill="EC6A9C"/>
-          </w:tcPr>
-          <w:p>
-            <w:pPr>
-              <w:spacing w:after="120"/>
-            </w:pPr>
-            <w:r>
-              <w:rPr>
-                <w:b/>
-                <w:bCs/>
-                <w:color w:val="FFFFFF"/>
-                <w:sz w:val="20"/>
-                <w:szCs w:val="20"/>
-              </w:rPr>
-              <w:t xml:space="preserve">Que faire</w:t>
-            </w:r>
-          </w:p>
-        </w:tc>
-      </w:tr>
-      <w:tr>
-        <w:tc>
-          <w:tcPr>
-            <w:tcW w:type="pct" w:w="32%"/>
-          </w:tcPr>
-          <w:p>
-            <w:pPr>
-              <w:spacing w:after="120"/>
-            </w:pPr>
-            <w:r>
-              <w:rPr>
-                <w:b/>
-                <w:bCs/>
-                <w:sz w:val="20"/>
-                <w:szCs w:val="20"/>
-              </w:rPr>
-              <w:t xml:space="preserve">Danger immédiat</w:t>
-            </w:r>
-          </w:p>
-        </w:tc>
-        <w:tc>
-          <w:p>
-            <w:pPr>
-              <w:spacing w:after="120"/>
-            </w:pPr>
-            <w:r>
-              <w:rPr>
-                <w:sz w:val="20"/>
-                <w:szCs w:val="20"/>
-              </w:rPr>
-              <w:t xml:space="preserve">17 / 112 (ou 15 / 18 si blessé)</w:t>
-            </w:r>
-          </w:p>
-        </w:tc>
-      </w:tr>
-      <w:tr>
-        <w:tc>
-          <w:tcPr>
-            <w:tcW w:type="pct" w:w="32%"/>
-          </w:tcPr>
-          <w:p>
-            <w:pPr>
-              <w:spacing w:after="120"/>
-            </w:pPr>
-            <w:r>
-              <w:rPr>
-                <w:b/>
-                <w:bCs/>
-                <w:sz w:val="20"/>
-                <w:szCs w:val="20"/>
-              </w:rPr>
-              <w:t xml:space="preserve">Réflexe principal</w:t>
-            </w:r>
-          </w:p>
-        </w:tc>
-        <w:tc>
-          <w:p>
-            <w:pPr>
-              <w:spacing w:after="120"/>
-            </w:pPr>
-            <w:r>
-              <w:rPr>
-                <w:sz w:val="20"/>
-                <w:szCs w:val="20"/>
-              </w:rPr>
-              <w:t xml:space="preserve">119 — gratuit, 24h/24, confidentiel (tchat sur allo119.gouv.fr), même en cas de doute</w:t>
-            </w:r>
-          </w:p>
-        </w:tc>
-      </w:tr>
-      <w:tr>
-        <w:tc>
-          <w:tcPr>
-            <w:tcW w:type="pct" w:w="32%"/>
-          </w:tcPr>
-          <w:p>
-            <w:pPr>
-              <w:spacing w:after="120"/>
-            </w:pPr>
-            <w:r>
-              <w:rPr>
-                <w:b/>
-                <w:bCs/>
-                <w:sz w:val="20"/>
-                <w:szCs w:val="20"/>
-              </w:rPr>
-              <w:t xml:space="preserve">Avis médical</w:t>
-            </w:r>
-          </w:p>
-        </w:tc>
-        <w:tc>
-          <w:p>
-            <w:pPr>
-              <w:spacing w:after="120"/>
-            </w:pPr>
-            <w:r>
-              <w:rPr>
-                <w:sz w:val="20"/>
-                <w:szCs w:val="20"/>
-              </w:rPr>
-              <w:t xml:space="preserve">médecin traitant / urgences pédiatriques / UAPED</w:t>
-            </w:r>
-          </w:p>
-        </w:tc>
-      </w:tr>
-      <w:tr>
-        <w:tc>
-          <w:tcPr>
-            <w:tcW w:type="pct" w:w="32%"/>
-          </w:tcPr>
-          <w:p>
-            <w:pPr>
-              <w:spacing w:after="120"/>
-            </w:pPr>
-            <w:r>
-              <w:rPr>
-                <w:b/>
-                <w:bCs/>
-                <w:sz w:val="20"/>
-                <w:szCs w:val="20"/>
-              </w:rPr>
-              <w:t xml:space="preserve">Institutionnel</w:t>
-            </w:r>
-          </w:p>
-        </w:tc>
-        <w:tc>
-          <w:p>
-            <w:pPr>
-              <w:spacing w:after="120"/>
-            </w:pPr>
-            <w:r>
-              <w:rPr>
-                <w:sz w:val="20"/>
-                <w:szCs w:val="20"/>
-              </w:rPr>
-              <w:t xml:space="preserve">CRIP (information préoccupante) ; procureur (signalement) — via le 119 ou un professionnel</w:t>
-            </w:r>
-          </w:p>
-        </w:tc>
-      </w:tr>
-    </w:tbl>
-    <w:p>
-      <w:pPr>
-        <w:spacing w:after="160"/>
-      </w:pPr>
-      <w:r>
-        <w:rPr>
-          <w:i/>
-          <w:iCs/>
-          <w:color w:val="7A6F77"/>
-          <w:sz w:val="18"/>
-          <w:szCs w:val="18"/>
-        </w:rPr>
-        <w:t xml:space="preserve">En cas de doute, appelez le 119 : c’est fait pour ça. Le coût d’une fausse alerte est faible ; celui d’un signal manqué est inacceptable.</w:t>
-      </w:r>
-    </w:p>
-    <w:p>
-      <w:pPr>
-        <w:pStyle w:val="Heading2"/>
-        <w:spacing w:before="240"/>
-      </w:pPr>
-      <w:r>
-        <w:t xml:space="preserve">Rappels pour l’adulte</w:t>
-      </w:r>
-    </w:p>
-    <w:p>
-      <w:pPr>
-        <w:pStyle w:val="ListParagraph"/>
-        <w:numPr>
-          <w:ilvl w:val="0"/>
-          <w:numId w:val="1"/>
-        </w:numPr>
-        <w:spacing w:after="60"/>
-      </w:pPr>
-      <w:r>
-        <w:t xml:space="preserve">Croire l’enfant et le lui dire ; le déculpabiliser (« ce n’est pas ta faute »).</w:t>
-      </w:r>
-    </w:p>
-    <w:p>
-      <w:pPr>
-        <w:pStyle w:val="ListParagraph"/>
-        <w:numPr>
-          <w:ilvl w:val="0"/>
-          <w:numId w:val="1"/>
-        </w:numPr>
-        <w:spacing w:after="60"/>
-      </w:pPr>
-      <w:r>
-        <w:t xml:space="preserve">Ne pas confronter la personne soupçonnée. Ne pas faire répéter l’enfant.</w:t>
-      </w:r>
-    </w:p>
-    <w:p>
-      <w:pPr>
-        <w:pStyle w:val="ListParagraph"/>
-        <w:numPr>
-          <w:ilvl w:val="0"/>
-          <w:numId w:val="1"/>
-        </w:numPr>
-        <w:spacing w:after="60"/>
-      </w:pPr>
-      <w:r>
-        <w:t xml:space="preserve">Ne pas mener soi-même l’interrogatoire : transmettre ce compte rendu à un professionnel.</w:t>
-      </w:r>
-    </w:p>
-    <w:p>
-      <w:pPr>
-        <w:pStyle w:val="ListParagraph"/>
-        <w:numPr>
-          <w:ilvl w:val="0"/>
-          <w:numId w:val="1"/>
-        </w:numPr>
-        <w:spacing w:after="60"/>
-      </w:pPr>
-      <w:r>
-        <w:t xml:space="preserve">Ne pas rester seul : 119, médecin, services de protection de l’enfance.</w:t>
-      </w:r>
-    </w:p>
-    <w:p>
-      <w:pPr>
         <w:spacing w:before="240"/>
       </w:pPr>
       <w:r>

</xml_diff>